<commit_message>
Close the blank regions under the full-width tables and Fig. 3.
Co-authored-by: Cursor <cursoragent@cursor.com>
</commit_message>
<xml_diff>
--- a/When Overall AUC Hides Miscalibration/manuscript-pack/manuscript/When Overall AUC Hides Miscalibration - Evaluating Knowledge Tracing on Rarely Practiced Knowledge Components.docx
+++ b/When Overall AUC Hides Miscalibration/manuscript-pack/manuscript/When Overall AUC Hides Miscalibration - Evaluating Knowledge Tracing on Rarely Practiced Knowledge Components.docx
@@ -219,10 +219,11 @@
         <w:ind w:firstLine="0"/>
         <w:rPr>
           <w:rFonts w:eastAsia="SimSun"/>
-          <w:sz w:val="18"/>
-          <w:szCs w:val="18"/>
+          <w:sz w:val="2"/>
+          <w:szCs w:val="2"/>
           <w:lang w:eastAsia="zh-CN"/>
         </w:rPr>
+        <w:spacing w:before="0" w:after="0" w:line="20" w:lineRule="exact"/>
       </w:pPr>
     </w:p>
     <w:p>
@@ -1702,7 +1703,7 @@
             <v:path o:extrusionok="f" gradientshapeok="t" o:connecttype="rect"/>
             <o:lock v:ext="edit" aspectratio="t"/>
           </v:shapetype>
-          <v:shape id="_x0000_i1025" type="#_x0000_t75" style="width:381.5pt;height:136.5pt">
+          <v:shape id="_x0000_i1025" type="#_x0000_t75" style="width:381.5pt;height:111pt">
             <v:imagedata r:id="rId15" o:title="fig1_pipeline"/>
             <o:lock v:ext="edit" aspectratio="f"/>
           </v:shape>
@@ -4372,7 +4373,6 @@
     <w:p>
       <w:pPr>
         <w:pStyle w:val="figurecaption0"/>
-        <w:keepNext/>
         <w:spacing w:before="40" w:after="40"/>
         <w:sectPr>
           <w:type w:val="continuous"/>
@@ -6037,7 +6037,6 @@
     <w:p>
       <w:pPr>
         <w:pStyle w:val="figurecaption0"/>
-        <w:keepNext/>
         <w:spacing w:before="40" w:after="40"/>
         <w:sectPr>
           <w:type w:val="continuous"/>
@@ -7163,7 +7162,6 @@
     <w:p>
       <w:pPr>
         <w:pStyle w:val="figurecaption0"/>
-        <w:keepNext/>
         <w:spacing w:before="40" w:after="40"/>
         <w:sectPr>
           <w:type w:val="continuous"/>
@@ -9061,134 +9059,6 @@
     </w:tbl>
     <w:p>
       <w:pPr>
-        <w:pStyle w:val="figurecaption0"/>
-        <w:keepNext/>
-        <w:spacing w:before="40" w:after="40"/>
-      </w:pPr>
-      <w:r>
-        <w:pict w14:anchorId="6205C121">
-          <v:shape id="_x0000_i1027" type="#_x0000_t75" style="width:384.5pt;height:356.5pt">
-            <v:imagedata r:id="rId17" o:title="fig2_reliability_p0"/>
-            <o:lock v:ext="edit" aspectratio="f"/>
-          </v:shape>
-        </w:pict>
-      </w:r>
-    </w:p>
-    <w:p>
-      <w:pPr>
-        <w:pStyle w:val="figurecaption0"/>
-        <w:keepNext/>
-        <w:spacing w:before="80" w:after="40"/>
-      </w:pPr>
-      <w:r>
-        <w:t xml:space="preserve">Fig. 3. </w:t>
-      </w:r>
-      <w:r>
-        <w:rPr>
-          <w:color w:val="FF0000"/>
-        </w:rPr>
-        <w:t>Final-checkpoint r</w:t>
-      </w:r>
-      <w:r>
-        <w:rPr/>
-        <w:t>eliability</w:t>
-      </w:r>
-      <w:r>
-        <w:t xml:space="preserve"> diagrams for DKT and T-KT (seed 42</w:t>
-      </w:r>
-      <w:r>
-        <w:rPr>
-          <w:color w:val="FF0000"/>
-        </w:rPr>
-        <w:t xml:space="preserve">; </w:t>
-      </w:r>
-      <w:r>
-        <w:rPr>
-          <w:color w:val="FF0000"/>
-        </w:rPr>
-        <w:t>full test history</w:t>
-      </w:r>
-      <w:r>
-        <w:rPr/>
-        <w:t>;</w:t>
-      </w:r>
-      <w:r>
-        <w:t xml:space="preserve"> 15 equal-width bins). Top: ASSISTments 2012, dense vs. sparse KCs. Bottom: Junyi Academy, dense vs. medium KCs (no sparse group). Tables 5 and A1 report </w:t>
-      </w:r>
-      <w:r>
-        <w:rPr>
-          <w:color w:val="FF0000"/>
-        </w:rPr>
-        <w:t>th</w:t>
-      </w:r>
-      <w:r>
-        <w:rPr/>
-        <w:t>e</w:t>
-      </w:r>
-      <w:r>
-        <w:rPr>
-          <w:color w:val="FF0000"/>
-        </w:rPr>
-        <w:t xml:space="preserve"> </w:t>
-      </w:r>
-      <w:r>
-        <w:rPr>
-          <w:color w:val="FF0000"/>
-        </w:rPr>
-        <w:t>correspo</w:t>
-      </w:r>
-      <w:r>
-        <w:rPr/>
-        <w:t>n</w:t>
-      </w:r>
-      <w:r>
-        <w:rPr>
-          <w:color w:val="FF0000"/>
-        </w:rPr>
-        <w:t>ding</w:t>
-      </w:r>
-      <w:r>
-        <w:t xml:space="preserve"> </w:t>
-      </w:r>
-      <w:r>
-        <w:rPr/>
-        <w:t>four</w:t>
-      </w:r>
-      <w:r>
-        <w:rPr>
-          <w:color w:val="FF0000"/>
-        </w:rPr>
-        <w:t>-</w:t>
-      </w:r>
-      <w:r>
-        <w:rPr/>
-        <w:t>partition</w:t>
-      </w:r>
-      <w:r>
-        <w:rPr>
-          <w:color w:val="FF0000"/>
-        </w:rPr>
-        <w:t xml:space="preserve"> </w:t>
-      </w:r>
-      <w:r>
-        <w:rPr>
-          <w:color w:val="FF0000"/>
-        </w:rPr>
-        <w:t>mean</w:t>
-      </w:r>
-      <w:r>
-        <w:rPr/>
-        <w:t>s.</w:t>
-      </w:r>
-      <w:r>
-        <w:rPr>
-          <w:color w:val="FF0000"/>
-        </w:rPr>
-        <w:t xml:space="preserve"> The validation-AUC checks are not plotted here.</w:t>
-      </w:r>
-    </w:p>
-    <w:p>
-      <w:pPr>
         <w:pStyle w:val="Text"/>
         <w:spacing w:line="252" w:lineRule="exact"/>
         <w:sectPr>
@@ -9246,7 +9116,6 @@
     <w:p>
       <w:pPr>
         <w:pStyle w:val="figurecaption0"/>
-        <w:keepNext/>
         <w:spacing w:before="40" w:after="40"/>
         <w:sectPr>
           <w:type w:val="continuous"/>
@@ -10771,6 +10640,134 @@
     </w:tbl>
     <w:p>
       <w:pPr>
+        <w:pStyle w:val="figurecaption0"/>
+        <w:keepNext/>
+        <w:spacing w:before="40" w:after="40"/>
+      </w:pPr>
+      <w:r>
+        <w:pict w14:anchorId="6205C121">
+          <v:shape id="_x0000_i1027" type="#_x0000_t75" style="width:384.5pt;height:356.5pt">
+            <v:imagedata r:id="rId17" o:title="fig2_reliability_p0"/>
+            <o:lock v:ext="edit" aspectratio="f"/>
+          </v:shape>
+        </w:pict>
+      </w:r>
+    </w:p>
+    <w:p>
+      <w:pPr>
+        <w:pStyle w:val="figurecaption0"/>
+        <w:keepNext/>
+        <w:spacing w:before="80" w:after="40"/>
+      </w:pPr>
+      <w:r>
+        <w:t xml:space="preserve">Fig. 3. </w:t>
+      </w:r>
+      <w:r>
+        <w:rPr>
+          <w:color w:val="FF0000"/>
+        </w:rPr>
+        <w:t>Final-checkpoint r</w:t>
+      </w:r>
+      <w:r>
+        <w:rPr/>
+        <w:t>eliability</w:t>
+      </w:r>
+      <w:r>
+        <w:t xml:space="preserve"> diagrams for DKT and T-KT (seed 42</w:t>
+      </w:r>
+      <w:r>
+        <w:rPr>
+          <w:color w:val="FF0000"/>
+        </w:rPr>
+        <w:t xml:space="preserve">; </w:t>
+      </w:r>
+      <w:r>
+        <w:rPr>
+          <w:color w:val="FF0000"/>
+        </w:rPr>
+        <w:t>full test history</w:t>
+      </w:r>
+      <w:r>
+        <w:rPr/>
+        <w:t>;</w:t>
+      </w:r>
+      <w:r>
+        <w:t xml:space="preserve"> 15 equal-width bins). Top: ASSISTments 2012, dense vs. sparse KCs. Bottom: Junyi Academy, dense vs. medium KCs (no sparse group). Tables 5 and A1 report </w:t>
+      </w:r>
+      <w:r>
+        <w:rPr>
+          <w:color w:val="FF0000"/>
+        </w:rPr>
+        <w:t>th</w:t>
+      </w:r>
+      <w:r>
+        <w:rPr/>
+        <w:t>e</w:t>
+      </w:r>
+      <w:r>
+        <w:rPr>
+          <w:color w:val="FF0000"/>
+        </w:rPr>
+        <w:t xml:space="preserve"> </w:t>
+      </w:r>
+      <w:r>
+        <w:rPr>
+          <w:color w:val="FF0000"/>
+        </w:rPr>
+        <w:t>correspo</w:t>
+      </w:r>
+      <w:r>
+        <w:rPr/>
+        <w:t>n</w:t>
+      </w:r>
+      <w:r>
+        <w:rPr>
+          <w:color w:val="FF0000"/>
+        </w:rPr>
+        <w:t>ding</w:t>
+      </w:r>
+      <w:r>
+        <w:t xml:space="preserve"> </w:t>
+      </w:r>
+      <w:r>
+        <w:rPr/>
+        <w:t>four</w:t>
+      </w:r>
+      <w:r>
+        <w:rPr>
+          <w:color w:val="FF0000"/>
+        </w:rPr>
+        <w:t>-</w:t>
+      </w:r>
+      <w:r>
+        <w:rPr/>
+        <w:t>partition</w:t>
+      </w:r>
+      <w:r>
+        <w:rPr>
+          <w:color w:val="FF0000"/>
+        </w:rPr>
+        <w:t xml:space="preserve"> </w:t>
+      </w:r>
+      <w:r>
+        <w:rPr>
+          <w:color w:val="FF0000"/>
+        </w:rPr>
+        <w:t>mean</w:t>
+      </w:r>
+      <w:r>
+        <w:rPr/>
+        <w:t>s.</w:t>
+      </w:r>
+      <w:r>
+        <w:rPr>
+          <w:color w:val="FF0000"/>
+        </w:rPr>
+        <w:t xml:space="preserve"> The validation-AUC checks are not plotted here.</w:t>
+      </w:r>
+    </w:p>
+    <w:p>
+      <w:pPr>
         <w:pStyle w:val="Text"/>
         <w:spacing w:line="252" w:lineRule="exact"/>
         <w:sectPr>
@@ -12611,7 +12608,6 @@
     <w:p>
       <w:pPr>
         <w:pStyle w:val="figurecaption0"/>
-        <w:keepNext/>
         <w:spacing w:before="40" w:after="40"/>
         <w:sectPr>
           <w:type w:val="continuous"/>

</xml_diff>